<commit_message>
data: use real bus stop coordinates and refresh captures
</commit_message>
<xml_diff>
--- a/docs/submission/seongnam_10min_access_visualization_result_official_data.docx
+++ b/docs/submission/seongnam_10min_access_visualization_result_official_data.docx
@@ -250,7 +250,7 @@
                 <w:color w:val="182B38"/>
                 <w:sz w:val="19"/>
               </w:rPr>
-              <w:t>· 성남시 버스공영차고지 현황(data.go.kr): 교통 기반시설 대리 지표 산정</w:t>
+              <w:t>· 경기교통정보센터 버스정류소 집계 + OpenStreetMap 정류장 좌표: 교통 접근성 산정</w:t>
             </w:r>
           </w:p>
           <w:p>
@@ -348,7 +348,7 @@
                 <w:color w:val="182B38"/>
                 <w:sz w:val="19"/>
               </w:rPr>
-              <w:t>· 노인복지관은 공식 시설 목록과 성남시 좌표 PDF를 결합했으며, 교통은 공영차고지 거리 기반 대리 지표로 표시했다.</w:t>
+              <w:t>· 노인복지관은 공식 시설 목록과 성남시 좌표 PDF를 결합했으며, 교통은 실제 버스정류장 좌표와의 거리로 표시했다.</w:t>
             </w:r>
           </w:p>
         </w:tc>
@@ -587,7 +587,7 @@
                 <w:color w:val="182B38"/>
                 <w:sz w:val="19"/>
               </w:rPr>
-              <w:t>보건소, 교통, 복지 부서가 같은 화면에서 우선 점검 생활권을 공유할 수 있다. 향후 버스정류장 전수 좌표, 보행 네트워크, 통신·카드 집계 데이터가 추가되면 실제 10분 도달성과 이용 수요를 결합한 정책 의사결정 도구로 확장할 수 있다.</w:t>
+              <w:t>보건소, 교통, 복지 부서가 같은 화면에서 우선 점검 생활권을 공유할 수 있다. 향후 보행 네트워크, 통신·카드 집계 데이터가 추가되면 실제 10분 도달성과 이용 수요를 결합한 정책 의사결정 도구로 확장할 수 있다.</w:t>
             </w:r>
           </w:p>
         </w:tc>
@@ -857,7 +857,7 @@
                 <w:color w:val="2F6F68"/>
                 <w:sz w:val="15"/>
               </w:rPr>
-              <w:t>버스공영차고지</w:t>
+              <w:t>버스정류소 집계</w:t>
             </w:r>
           </w:p>
         </w:tc>
@@ -883,7 +883,61 @@
                 <w:color w:val="3E4D56"/>
                 <w:sz w:val="15"/>
               </w:rPr>
-              <w:t>https://www.data.go.kr/data/15061124/fileData.do</w:t>
+              <w:t>https://gits.gg.go.kr/gtdb/web/trafficDb/publicTransport/busStop.do</w:t>
+            </w:r>
+          </w:p>
+        </w:tc>
+      </w:tr>
+      <w:tr>
+        <w:tc>
+          <w:tcPr>
+            <w:tcW w:type="dxa" w:w="5241"/>
+            <w:tcBorders>
+              <w:top w:val="single" w:sz="6" w:space="0" w:color="E5E0D6"/>
+              <w:left w:val="single" w:sz="6" w:space="0" w:color="E5E0D6"/>
+              <w:bottom w:val="single" w:sz="6" w:space="0" w:color="E5E0D6"/>
+              <w:right w:val="single" w:sz="6" w:space="0" w:color="E5E0D6"/>
+            </w:tcBorders>
+          </w:tcPr>
+          <w:p>
+            <w:pPr>
+              <w:spacing w:line="324" w:lineRule="auto" w:after="0"/>
+            </w:pPr>
+            <w:r/>
+            <w:r>
+              <w:rPr>
+                <w:rFonts w:ascii="맑은 고딕" w:hAnsi="맑은 고딕" w:eastAsia="맑은 고딕"/>
+                <w:b/>
+                <w:color w:val="2F6F68"/>
+                <w:sz w:val="15"/>
+              </w:rPr>
+              <w:t>버스정류장 좌표</w:t>
+            </w:r>
+          </w:p>
+        </w:tc>
+        <w:tc>
+          <w:tcPr>
+            <w:tcW w:type="dxa" w:w="5241"/>
+            <w:tcBorders>
+              <w:top w:val="single" w:sz="6" w:space="0" w:color="E5E0D6"/>
+              <w:left w:val="single" w:sz="6" w:space="0" w:color="E5E0D6"/>
+              <w:bottom w:val="single" w:sz="6" w:space="0" w:color="E5E0D6"/>
+              <w:right w:val="single" w:sz="6" w:space="0" w:color="E5E0D6"/>
+            </w:tcBorders>
+          </w:tcPr>
+          <w:p>
+            <w:pPr>
+              <w:spacing w:line="324" w:lineRule="auto" w:after="0"/>
+            </w:pPr>
+            <w:r/>
+            <w:r>
+              <w:rPr>
+                <w:rFonts w:ascii="맑은 고딕" w:hAnsi="맑은 고딕" w:eastAsia="맑은 고딕"/>
+                <w:b w:val="0"/>
+                <w:color w:val="3E4D56"/>
+                <w:sz w:val="15"/>
+              </w:rPr>
+              <w:t>https://overpass-api.de/</w:t>
             </w:r>
           </w:p>
         </w:tc>
@@ -1095,7 +1149,7 @@
           <w:color w:val="3E4D56"/>
           <w:sz w:val="20"/>
         </w:rPr>
-        <w:t>· 교통 지표는 버스정류장 전수 접근성이 아니라 공영차고지 거리 기반 대리 지표다. 발표 시 이 부분을 한계로 명시하고, 정류장 좌표 확보 후 재산출한다고 설명한다.</w:t>
+        <w:t>· 교통 지표는 실제 버스정류장 좌표와 대표 동 중심점의 직선거리 기반이다. 발표 시 보행 네트워크 이동시간은 아직 반영하지 않았다고 설명한다.</w:t>
       </w:r>
     </w:p>
     <w:p>

</xml_diff>